<commit_message>
Add authenticated distributed wire prototype, physical test harness and verified Chromium architecture; retain frozen policy evidence and explicit hardware limits
</commit_message>
<xml_diff>
--- a/publication/redesigned/JICCE_Redesigned_Manuscript.docx
+++ b/publication/redesigned/JICCE_Redesigned_Manuscript.docx
@@ -2021,7 +2021,7 @@
           <w:rFonts w:ascii="Times New Roman" w:hAnsi="Times New Roman"/>
           <w:color w:val="000000"/>
         </w:rPr>
-        <w:t>State locality is incomplete. Geometry, packet history and reverse receipt paths are simulator inputs; beacon values use receive-gated metadata. Source-only service debt does not establish transit-aware distributed queue control. Forged receipts, deceptive telemetry, compromised sources, collusion and mobility are untested. Successful passive transmission is evidence of an attempt, not intended-receiver delivery, and the effective-count score is not a live intrusion detector.</w:t>
+        <w:t>State locality is incomplete in the frozen benchmark. Geometry, packet history and reverse receipt paths are simulator inputs; beacon values use receive-gated metadata. Source-only service debt does not establish transit-aware distributed queue control. Forged receipts, deceptive telemetry, compromised sources, collusion and mobility are untested. Successful passive transmission is evidence of an attempt, not intended-receiver delivery, and the effective-count score is not a live intrusion detector.</w:t>
       </w:r>
     </w:p>
     <w:p>
@@ -2081,7 +2081,7 @@
           <w:rFonts w:ascii="Times New Roman" w:hAnsi="Times New Roman"/>
           <w:color w:val="000000"/>
         </w:rPr>
-        <w:t>C. Conclusions</w:t>
+        <w:t>C. Post holdout engineering extension</w:t>
       </w:r>
     </w:p>
     <w:p>
@@ -2093,7 +2093,67 @@
           <w:rFonts w:ascii="Times New Roman" w:hAnsi="Times New Roman"/>
           <w:color w:val="000000"/>
         </w:rPr>
-        <w:t>Receipt assisted passive feedback passed a prespecified incremental gate on 30 new simulation fixtures. Blackhole delivery improved by 4.67 percentage points over active proofs, and the declared frozen-prior non-inferiority margins held. The matched controls did not establish a unique censoring or attention advantage. Energy efficiency improved through delivered-byte yield while total modeled radio joules increased slightly. The defensible contribution is a reproducible feedback comparison with explicit attribution boundaries; authentication, embedded state exchange and absolute service compliance remain open.</w:t>
+        <w:t>A separate reference transport now serializes neighbor coordinates, local radio energy and queue state into received frame bytes. Each node maintains its own cache, reverse-receipt records and transit-service debt; a 13-byte visited bitset travels with the packet. Pairwise HMAC-SHA256 with a 128-bit tag authenticates hop messages [20]. Provisioned boot sessions and a 64-entry replay window reject stale or repeated messages. A source authenticator binds immutable data fields, and Ed25519 verifies sink-generated receipts [21]. Forwarding credit also requires the local first-hop MAC acknowledgment. Pairwise keys cannot authenticate a third party’s overheard onward transmission, so that observation is not credited in this extension.</w:t>
+      </w:r>
+    </w:p>
+    <w:p>
+      <w:pPr>
+        <w:widowControl/>
+      </w:pPr>
+      <w:r>
+        <w:rPr>
+          <w:rFonts w:ascii="Times New Roman" w:hAnsi="Times New Roman"/>
+          <w:color w:val="000000"/>
+        </w:rPr>
+        <w:t>The transport uses at most 114 application bytes per frame and up to 128 pending records per node with 2 s retirement. Keys are provisioned out of band; configuration reuse after a host restart is blocked by a persistent marker. This remains a host reference implementation without online key exchange or protected key storage. Legitimate key holders can still lie in their own telemetry or drop traffic. These mechanisms establish functional authentication checks, not a formal security proof or physical-device validation.</w:t>
+      </w:r>
+    </w:p>
+    <w:p>
+      <w:pPr>
+        <w:widowControl/>
+      </w:pPr>
+      <w:r>
+        <w:rPr>
+          <w:rFonts w:ascii="Times New Roman" w:hAnsi="Times New Roman"/>
+          <w:color w:val="000000"/>
+        </w:rPr>
+        <w:t>Thirty separate four-node chain fixtures, seeds 82001–82030, offered 300 packets and delivered 295. All fixtures, including packet and receipt losses, were retained. Thirty modified telemetry messages and 30 replayed messages received by the observer were rejected. An audit matched 2,552 received frames to prior transmitted bytes, verified 885 signed receipt transmissions and checked 120 modeled node-energy identities. This engineering control uses greedy progress routing; it is not an evaluation of the frozen attention policy on the new transport. Its delivery rate must not be compared directly with the 100-sensor holdout or substituted into that study’s decision gate.</w:t>
+      </w:r>
+    </w:p>
+    <w:p>
+      <w:pPr>
+        <w:widowControl/>
+      </w:pPr>
+      <w:r>
+        <w:rPr>
+          <w:rFonts w:ascii="Times New Roman" w:hAnsi="Times New Roman"/>
+          <w:color w:val="000000"/>
+        </w:rPr>
+        <w:t>The accompanying interactive architecture distinguishes the frozen benchmark from this authenticated transport. Real Chromium checks cover both versions at three widths and in light and dark themes. A serial radio adapter, private provisioning utility and current-trace integration tool prepare physical testing. No sensor boards or measured current captures were available here; board-specific firmware integration, instrument calibration and physical validation remain outstanding.</w:t>
+      </w:r>
+    </w:p>
+    <w:p>
+      <w:pPr>
+        <w:pStyle w:val="Heading2"/>
+      </w:pPr>
+      <w:r>
+        <w:rPr>
+          <w:rFonts w:ascii="Times New Roman" w:hAnsi="Times New Roman"/>
+          <w:color w:val="000000"/>
+        </w:rPr>
+        <w:t>D. Conclusions</w:t>
+      </w:r>
+    </w:p>
+    <w:p>
+      <w:pPr>
+        <w:widowControl/>
+      </w:pPr>
+      <w:r>
+        <w:rPr>
+          <w:rFonts w:ascii="Times New Roman" w:hAnsi="Times New Roman"/>
+          <w:color w:val="000000"/>
+        </w:rPr>
+        <w:t>Receipt assisted passive feedback passed a prespecified incremental gate on 30 new simulation fixtures. Blackhole delivery improved by 4.67 percentage points over active proofs, and the declared frozen-prior non-inferiority margins held. The matched controls did not establish a unique censoring or attention advantage. Energy efficiency improved through delivered-byte yield while total modeled radio joules increased slightly. The defensible contribution is a reproducible feedback comparison with explicit attribution boundaries. Integrated evaluation of the frozen policy with authenticated embedded state exchange and absolute service compliance remains open.</w:t>
       </w:r>
     </w:p>
     <w:p>
@@ -2401,6 +2461,32 @@
           <w:color w:val="000000"/>
         </w:rPr>
         <w:t>[19] S. Holm, “A simple sequentially rejective multiple test procedure,” Scandinavian Journal of Statistics, vol. 6, no. 2, pp. 65–70, 1979. Available: https://www.jstor.org/stable/4615733.</w:t>
+      </w:r>
+    </w:p>
+    <w:p>
+      <w:pPr>
+        <w:widowControl/>
+        <w:spacing w:line="276" w:lineRule="auto" w:after="140"/>
+      </w:pPr>
+      <w:r>
+        <w:rPr>
+          <w:rFonts w:ascii="Times New Roman" w:hAnsi="Times New Roman"/>
+          <w:color w:val="000000"/>
+        </w:rPr>
+        <w:t>[20] H. Krawczyk, M. Bellare, and R. Canetti, “HMAC: Keyed-hashing for message authentication,” IETF, RFC 2104, 1997. DOI: 10.17487/RFC2104.</w:t>
+      </w:r>
+    </w:p>
+    <w:p>
+      <w:pPr>
+        <w:widowControl/>
+        <w:spacing w:line="276" w:lineRule="auto" w:after="140"/>
+      </w:pPr>
+      <w:r>
+        <w:rPr>
+          <w:rFonts w:ascii="Times New Roman" w:hAnsi="Times New Roman"/>
+          <w:color w:val="000000"/>
+        </w:rPr>
+        <w:t>[21] S. Josefsson and I. Liusvaara, “Edwards-curve digital signature algorithm (EdDSA),” IETF, RFC 8032, 2017. DOI: 10.17487/RFC8032.</w:t>
       </w:r>
     </w:p>
     <w:p>

</xml_diff>